<commit_message>
Generaliza simulador para topologia de rede genérica (T1)
Estende o motor de simulação do M6 pra carregar a topologia de um
arquivo .yml (mesmo estilo do simulador do módulo 3), em vez de vir
fixa no código Python. Adiciona suporte a filas com capacidade
ilimitada. Roda a rede de validação pedida no enunciado (Q1 -> Q2/Q3,
Q2 <-> Q3 e Q2 -> Q1) e preenche o docx com os resultados.

Cross-validado contra o simulator.jar do módulo 3 na mesma topologia:
probabilidades por estado e número de perdas na mesma faixa em todas
as filas.

Co-Authored-By: Claude Sonnet 5 <noreply@anthropic.com>
</commit_message>
<xml_diff>
--- a/T1 - Avaliação de Aprendizagem/T1 - Avaliação de Aprendizagem.docx
+++ b/T1 - Avaliação de Aprendizagem/T1 - Avaliação de Aprendizagem.docx
@@ -51,52 +51,13 @@
           <w:color w:val="000000"/>
           <w:shd w:val="clear" w:color="auto" w:fill="FFFFFF"/>
         </w:rPr>
-        <w:t> </w:t>
-      </w:r>
-      <w:r>
-        <w:rPr>
-          <w:rStyle w:val="normaltextrun"/>
-          <w:rFonts w:ascii="Calibri" w:hAnsi="Calibri" w:cs="Calibri"/>
-          <w:color w:val="000000"/>
-          <w:shd w:val="clear" w:color="auto" w:fill="FFFFFF"/>
-        </w:rPr>
-        <w:t>UA</w:t>
-      </w:r>
-      <w:r>
-        <w:rPr>
-          <w:rStyle w:val="normaltextrun"/>
-          <w:rFonts w:ascii="Calibri" w:hAnsi="Calibri" w:cs="Calibri"/>
-          <w:color w:val="000000"/>
-          <w:shd w:val="clear" w:color="auto" w:fill="FFFFFF"/>
-        </w:rPr>
-        <w:t>2</w:t>
-      </w:r>
-      <w:r>
-        <w:rPr>
-          <w:rStyle w:val="normaltextrun"/>
-          <w:rFonts w:ascii="Calibri" w:hAnsi="Calibri" w:cs="Calibri"/>
-          <w:color w:val="000000"/>
-          <w:shd w:val="clear" w:color="auto" w:fill="FFFFFF"/>
-        </w:rPr>
-        <w:t xml:space="preserve"> | </w:t>
+        <w:t xml:space="preserve"> UA2 | </w:t>
       </w:r>
       <w:r>
         <w:rPr>
           <w:bCs/>
         </w:rPr>
-        <w:t>F</w:t>
-      </w:r>
-      <w:r>
-        <w:rPr>
-          <w:bCs/>
-        </w:rPr>
-        <w:t>U</w:t>
-      </w:r>
-      <w:r>
-        <w:rPr>
-          <w:bCs/>
-        </w:rPr>
-        <w:t>NDAMENTOS DE SIMULAÇÃO POR COMPUTADOR</w:t>
+        <w:t>FUNDAMENTOS DE SIMULAÇÃO POR COMPUTADOR</w:t>
       </w:r>
     </w:p>
     <w:p>
@@ -117,43 +78,7 @@
         <w:rPr>
           <w:bCs/>
         </w:rPr>
-        <w:t xml:space="preserve"> </w:t>
-      </w:r>
-      <w:r>
-        <w:rPr>
-          <w:bCs/>
-        </w:rPr>
-        <w:t>M</w:t>
-      </w:r>
-      <w:r>
-        <w:rPr>
-          <w:bCs/>
-        </w:rPr>
-        <w:t>8</w:t>
-      </w:r>
-      <w:r>
-        <w:rPr>
-          <w:bCs/>
-        </w:rPr>
-        <w:t xml:space="preserve"> </w:t>
-      </w:r>
-      <w:r>
-        <w:rPr>
-          <w:bCs/>
-        </w:rPr>
-        <w:t xml:space="preserve">| </w:t>
-      </w:r>
-      <w:r>
-        <w:rPr>
-          <w:bCs/>
-        </w:rPr>
-        <w:t xml:space="preserve">DESENVOLVIMENTO DE SIMULADOR PARA REDE </w:t>
-      </w:r>
-      <w:r>
-        <w:rPr>
-          <w:bCs/>
-        </w:rPr>
-        <w:t>DE FILAS</w:t>
+        <w:t xml:space="preserve"> M8 | DESENVOLVIMENTO DE SIMULADOR PARA REDE DE FILAS</w:t>
       </w:r>
     </w:p>
     <w:p>
@@ -168,6 +93,9 @@
           <w:b/>
         </w:rPr>
         <w:t xml:space="preserve">Estudantes: </w:t>
+      </w:r>
+      <w:r>
+        <w:t>Guilherme Guimarães Santos e Jully Anne Seyffert da Silva Jara</w:t>
       </w:r>
     </w:p>
     <w:p>
@@ -263,35 +191,7 @@
           <w:b/>
           <w:bCs/>
         </w:rPr>
-        <w:t>Entrega</w:t>
-      </w:r>
-      <w:r>
-        <w:rPr>
-          <w:b/>
-          <w:bCs/>
-        </w:rPr>
-        <w:t xml:space="preserve"> | </w:t>
-      </w:r>
-      <w:r>
-        <w:rPr>
-          <w:b/>
-          <w:bCs/>
-        </w:rPr>
-        <w:t xml:space="preserve">Simulador para Rede de </w:t>
-      </w:r>
-      <w:r>
-        <w:rPr>
-          <w:b/>
-          <w:bCs/>
-        </w:rPr>
-        <w:t>Fila</w:t>
-      </w:r>
-      <w:r>
-        <w:rPr>
-          <w:b/>
-          <w:bCs/>
-        </w:rPr>
-        <w:t>s</w:t>
+        <w:t xml:space="preserve">Entrega | Simulador para Rede de Filas</w:t>
       </w:r>
     </w:p>
     <w:p>
@@ -348,13 +248,7 @@
               </w:numPr>
             </w:pPr>
             <w:r>
-              <w:t>Link para o c</w:t>
-            </w:r>
-            <w:r>
-              <w:t>ódigo fonte do grupo</w:t>
-            </w:r>
-            <w:r>
-              <w:t>:</w:t>
+              <w:t>Link para o código fonte do grupo:</w:t>
             </w:r>
           </w:p>
           <w:p/>
@@ -369,13 +263,11 @@
             <w:tcW w:w="9629" w:type="dxa"/>
             <w:shd w:val="clear" w:color="auto" w:fill="FFFFFF" w:themeFill="background1"/>
           </w:tcPr>
-          <w:p/>
-          <w:p/>
-          <w:p/>
-          <w:p/>
-          <w:p/>
-          <w:p/>
-          <w:p/>
+          <w:p>
+            <w:r>
+              <w:t xml:space="preserve">https://github.com/Quidoguim/SMA</w:t>
+            </w:r>
+          </w:p>
         </w:tc>
       </w:tr>
       <w:tr>
@@ -402,24 +294,20 @@
                 <w:b/>
                 <w:bCs/>
               </w:rPr>
-              <w:t xml:space="preserve">Resultado da Fila 1: </w:t>
+              <w:t xml:space="preserve">Resultado da Fila 1: G/G/1</w:t>
+            </w:r>
+            <w:r>
+              <w:t>, chegadas entre</w:t>
             </w:r>
             <w:r>
               <w:rPr>
                 <w:b/>
                 <w:bCs/>
               </w:rPr>
-              <w:t>G/G/</w:t>
-            </w:r>
-            <w:r>
-              <w:rPr>
-                <w:b/>
-                <w:bCs/>
-              </w:rPr>
-              <w:t>1</w:t>
-            </w:r>
-            <w:r>
-              <w:t>, chegadas entre</w:t>
+              <w:t xml:space="preserve"> 2..4</w:t>
+            </w:r>
+            <w:r>
+              <w:t>, atendimento</w:t>
             </w:r>
             <w:r>
               <w:rPr>
@@ -428,71 +316,15 @@
               </w:rPr>
               <w:t xml:space="preserve"> </w:t>
             </w:r>
-            <w:proofErr w:type="gramStart"/>
+            <w:r>
+              <w:t>entre</w:t>
+            </w:r>
             <w:r>
               <w:rPr>
                 <w:b/>
                 <w:bCs/>
               </w:rPr>
-              <w:t>2</w:t>
-            </w:r>
-            <w:r>
-              <w:rPr>
-                <w:b/>
-                <w:bCs/>
-              </w:rPr>
-              <w:t>..</w:t>
-            </w:r>
-            <w:proofErr w:type="gramEnd"/>
-            <w:r>
-              <w:rPr>
-                <w:b/>
-                <w:bCs/>
-              </w:rPr>
-              <w:t>4</w:t>
-            </w:r>
-            <w:r>
-              <w:t>, atendimento</w:t>
-            </w:r>
-            <w:r>
-              <w:rPr>
-                <w:b/>
-                <w:bCs/>
-              </w:rPr>
-              <w:t xml:space="preserve"> </w:t>
-            </w:r>
-            <w:r>
-              <w:t>entre</w:t>
-            </w:r>
-            <w:r>
-              <w:rPr>
-                <w:b/>
-                <w:bCs/>
-              </w:rPr>
-              <w:t xml:space="preserve"> </w:t>
-            </w:r>
-            <w:proofErr w:type="gramStart"/>
-            <w:r>
-              <w:rPr>
-                <w:b/>
-                <w:bCs/>
-              </w:rPr>
-              <w:t>1</w:t>
-            </w:r>
-            <w:r>
-              <w:rPr>
-                <w:b/>
-                <w:bCs/>
-              </w:rPr>
-              <w:t>..</w:t>
-            </w:r>
-            <w:proofErr w:type="gramEnd"/>
-            <w:r>
-              <w:rPr>
-                <w:b/>
-                <w:bCs/>
-              </w:rPr>
-              <w:t>2</w:t>
+              <w:t xml:space="preserve"> 1..2</w:t>
             </w:r>
             <w:r>
               <w:t>:</w:t>
@@ -507,12 +339,78 @@
             <w:tcW w:w="9629" w:type="dxa"/>
             <w:shd w:val="clear" w:color="auto" w:fill="FFFFFF" w:themeFill="background1"/>
           </w:tcPr>
-          <w:p/>
-          <w:p/>
-          <w:p/>
-          <w:p/>
-          <w:p/>
-          <w:p/>
+          <w:p>
+            <w:r>
+              <w:rPr>
+                <w:b/>
+                <w:bCs/>
+              </w:rPr>
+              <w:t xml:space="preserve">Resultados da simulação — Fila 1 (G/G/1, capacidade ilimitada)</w:t>
+            </w:r>
+          </w:p>
+          <w:p>
+            <w:r>
+              <w:t xml:space="preserve">Números pseudoaleatórios utilizados na simulação da rede: 100.000</w:t>
+            </w:r>
+          </w:p>
+          <w:p>
+            <w:r>
+              <w:t xml:space="preserve">Tempo global da simulação (rede completa): 50.750,10</w:t>
+            </w:r>
+          </w:p>
+          <w:p>
+            <w:r>
+              <w:t xml:space="preserve">Clientes perdidos (bloqueados) na Fila 1: 0</w:t>
+            </w:r>
+          </w:p>
+          <w:p>
+            <w:r>
+              <w:rPr>
+                <w:b/>
+                <w:bCs/>
+              </w:rPr>
+              <w:t xml:space="preserve">Distribuição de probabilidades por estado (tempo acumulado / probabilidade):</w:t>
+            </w:r>
+          </w:p>
+          <w:p>
+            <w:r>
+              <w:t xml:space="preserve">Estado 0: 20.352,45  (40,1033%)</w:t>
+            </w:r>
+          </w:p>
+          <w:p>
+            <w:r>
+              <w:t xml:space="preserve">Estado 1: 26.619,82  (52,4527%)</w:t>
+            </w:r>
+          </w:p>
+          <w:p>
+            <w:r>
+              <w:t xml:space="preserve">Estado 2: 3.620,27  (7,1335%)</w:t>
+            </w:r>
+          </w:p>
+          <w:p>
+            <w:r>
+              <w:t xml:space="preserve">Estado 3: 155,09  (0,3056%)</w:t>
+            </w:r>
+          </w:p>
+          <w:p>
+            <w:r>
+              <w:t xml:space="preserve">Estado 4: 2,48  (0,0049%)</w:t>
+            </w:r>
+          </w:p>
+          <w:p>
+            <w:r>
+              <w:rPr>
+                <w:b/>
+                <w:bCs/>
+              </w:rPr>
+              <w:t xml:space="preserve">Análise:</w:t>
+            </w:r>
+          </w:p>
+          <w:p>
+            <w:r>
+              <w:t xml:space="preserve">Com chegadas externas entre 2 e 4 (média 3) e atendimento entre 1 e 2 (média 1,5) em 1 servidor, a carga oferecida é ρ ≈ 1,5/3 = 0,5 — sistema estável, e como não há limite de capacidade não há perdas. A fila passa a maior parte do tempo (92,55%) vazia ou com 1 cliente; estados acima de 2 clientes são raros (0,31%).</w:t>
+            </w:r>
+          </w:p>
         </w:tc>
       </w:tr>
       <w:tr>
@@ -535,61 +433,17 @@
                 <w:b/>
                 <w:bCs/>
               </w:rPr>
-              <w:t xml:space="preserve">Resultado da Fila 2: </w:t>
+              <w:t xml:space="preserve">Resultado da Fila 2: G/G/2/5</w:t>
+            </w:r>
+            <w:r>
+              <w:t>, atendimento entre</w:t>
             </w:r>
             <w:r>
               <w:rPr>
                 <w:b/>
                 <w:bCs/>
               </w:rPr>
-              <w:t>G/G/</w:t>
-            </w:r>
-            <w:r>
-              <w:rPr>
-                <w:b/>
-                <w:bCs/>
-              </w:rPr>
-              <w:t>2</w:t>
-            </w:r>
-            <w:r>
-              <w:rPr>
-                <w:b/>
-                <w:bCs/>
-              </w:rPr>
-              <w:t>/5</w:t>
-            </w:r>
-            <w:r>
-              <w:t>, atendimento entre</w:t>
-            </w:r>
-            <w:r>
-              <w:rPr>
-                <w:b/>
-                <w:bCs/>
-              </w:rPr>
-              <w:t xml:space="preserve"> </w:t>
-            </w:r>
-            <w:proofErr w:type="gramStart"/>
-            <w:r>
-              <w:rPr>
-                <w:b/>
-                <w:bCs/>
-              </w:rPr>
-              <w:t>4</w:t>
-            </w:r>
-            <w:r>
-              <w:rPr>
-                <w:b/>
-                <w:bCs/>
-              </w:rPr>
-              <w:t>..</w:t>
-            </w:r>
-            <w:proofErr w:type="gramEnd"/>
-            <w:r>
-              <w:rPr>
-                <w:b/>
-                <w:bCs/>
-              </w:rPr>
-              <w:t>6</w:t>
+              <w:t xml:space="preserve"> 4..6</w:t>
             </w:r>
             <w:r>
               <w:t>:</w:t>
@@ -604,12 +458,83 @@
             <w:tcW w:w="9629" w:type="dxa"/>
             <w:shd w:val="clear" w:color="auto" w:fill="FFFFFF" w:themeFill="background1"/>
           </w:tcPr>
-          <w:p/>
-          <w:p/>
-          <w:p/>
-          <w:p/>
-          <w:p/>
-          <w:p/>
+          <w:p>
+            <w:r>
+              <w:rPr>
+                <w:b/>
+                <w:bCs/>
+              </w:rPr>
+              <w:t xml:space="preserve">Resultados da simulação — Fila 2 (G/G/2/5), rede com a Fila 1 e a Fila 3</w:t>
+            </w:r>
+          </w:p>
+          <w:p>
+            <w:r>
+              <w:t xml:space="preserve">Números pseudoaleatórios utilizados na simulação da rede: 100.000</w:t>
+            </w:r>
+          </w:p>
+          <w:p>
+            <w:r>
+              <w:t xml:space="preserve">Tempo global da simulação (rede completa): 50.750,10</w:t>
+            </w:r>
+          </w:p>
+          <w:p>
+            <w:r>
+              <w:t xml:space="preserve">Clientes perdidos (bloqueados) na Fila 2: 6</w:t>
+            </w:r>
+          </w:p>
+          <w:p>
+            <w:r>
+              <w:rPr>
+                <w:b/>
+                <w:bCs/>
+              </w:rPr>
+              <w:t xml:space="preserve">Distribuição de probabilidades por estado (tempo acumulado / probabilidade):</w:t>
+            </w:r>
+          </w:p>
+          <w:p>
+            <w:r>
+              <w:t xml:space="preserve">Estado 0: 12.280,10  (24,1972%)</w:t>
+            </w:r>
+          </w:p>
+          <w:p>
+            <w:r>
+              <w:t xml:space="preserve">Estado 1: 20.984,81  (41,3493%)</w:t>
+            </w:r>
+          </w:p>
+          <w:p>
+            <w:r>
+              <w:t xml:space="preserve">Estado 2: 13.125,58  (25,8632%)</w:t>
+            </w:r>
+          </w:p>
+          <w:p>
+            <w:r>
+              <w:t xml:space="preserve">Estado 3: 3.746,09  (7,3814%)</w:t>
+            </w:r>
+          </w:p>
+          <w:p>
+            <w:r>
+              <w:t xml:space="preserve">Estado 4: 544,84  (1,0736%)</w:t>
+            </w:r>
+          </w:p>
+          <w:p>
+            <w:r>
+              <w:t xml:space="preserve">Estado 5: 68,68  (0,1353%)</w:t>
+            </w:r>
+          </w:p>
+          <w:p>
+            <w:r>
+              <w:rPr>
+                <w:b/>
+                <w:bCs/>
+              </w:rPr>
+              <w:t xml:space="preserve">Análise:</w:t>
+            </w:r>
+          </w:p>
+          <w:p>
+            <w:r>
+              <w:t xml:space="preserve">A Fila 2 recebe 20% do que sai da Fila 1 e ainda realimenta a própria rede: 30% do que atende volta pra Fila 1 e 50% vai pra Fila 3, só 20% sai do sistema. Esse retorno constante mantém a fila naturalmente ocupada (75,5% do tempo com 2 ou mais clientes), mas com capacidade K=5 as perdas ficam baixas (6 em 100.000 aleatórios).</w:t>
+            </w:r>
+          </w:p>
         </w:tc>
       </w:tr>
     </w:tbl>
@@ -658,68 +583,17 @@
                 <w:b/>
                 <w:bCs/>
               </w:rPr>
-              <w:t xml:space="preserve">Resultado da Fila 3: </w:t>
+              <w:t xml:space="preserve">Resultado da Fila 3: G/G/2/10</w:t>
+            </w:r>
+            <w:r>
+              <w:t>, atendimento entre</w:t>
             </w:r>
             <w:r>
               <w:rPr>
                 <w:b/>
                 <w:bCs/>
               </w:rPr>
-              <w:t>G/G/</w:t>
-            </w:r>
-            <w:r>
-              <w:rPr>
-                <w:b/>
-                <w:bCs/>
-              </w:rPr>
-              <w:t>2</w:t>
-            </w:r>
-            <w:r>
-              <w:rPr>
-                <w:b/>
-                <w:bCs/>
-              </w:rPr>
-              <w:t>/</w:t>
-            </w:r>
-            <w:r>
-              <w:rPr>
-                <w:b/>
-                <w:bCs/>
-              </w:rPr>
-              <w:t>10</w:t>
-            </w:r>
-            <w:r>
-              <w:t>, atendimento entre</w:t>
-            </w:r>
-            <w:r>
-              <w:rPr>
-                <w:b/>
-                <w:bCs/>
-              </w:rPr>
-              <w:t xml:space="preserve"> </w:t>
-            </w:r>
-            <w:proofErr w:type="gramStart"/>
-            <w:r>
-              <w:rPr>
-                <w:b/>
-                <w:bCs/>
-              </w:rPr>
-              <w:t>5</w:t>
-            </w:r>
-            <w:r>
-              <w:rPr>
-                <w:b/>
-                <w:bCs/>
-              </w:rPr>
-              <w:t>..</w:t>
-            </w:r>
-            <w:proofErr w:type="gramEnd"/>
-            <w:r>
-              <w:rPr>
-                <w:b/>
-                <w:bCs/>
-              </w:rPr>
-              <w:t>15</w:t>
+              <w:t xml:space="preserve"> 5..15</w:t>
             </w:r>
             <w:r>
               <w:t>:</w:t>
@@ -734,12 +608,108 @@
             <w:tcW w:w="9629" w:type="dxa"/>
             <w:shd w:val="clear" w:color="auto" w:fill="FFFFFF" w:themeFill="background1"/>
           </w:tcPr>
-          <w:p/>
-          <w:p/>
-          <w:p/>
-          <w:p/>
-          <w:p/>
-          <w:p/>
+          <w:p>
+            <w:r>
+              <w:rPr>
+                <w:b/>
+                <w:bCs/>
+              </w:rPr>
+              <w:t xml:space="preserve">Resultados da simulação — Fila 3 (G/G/2/10), rede com a Fila 1 e a Fila 2</w:t>
+            </w:r>
+          </w:p>
+          <w:p>
+            <w:r>
+              <w:t xml:space="preserve">Números pseudoaleatórios utilizados na simulação da rede: 100.000</w:t>
+            </w:r>
+          </w:p>
+          <w:p>
+            <w:r>
+              <w:t xml:space="preserve">Tempo global da simulação (rede completa): 50.750,10</w:t>
+            </w:r>
+          </w:p>
+          <w:p>
+            <w:r>
+              <w:t xml:space="preserve">Clientes perdidos (bloqueados) na Fila 3: 11.583</w:t>
+            </w:r>
+          </w:p>
+          <w:p>
+            <w:r>
+              <w:rPr>
+                <w:b/>
+                <w:bCs/>
+              </w:rPr>
+              <w:t xml:space="preserve">Distribuição de probabilidades por estado (tempo acumulado / probabilidade):</w:t>
+            </w:r>
+          </w:p>
+          <w:p>
+            <w:r>
+              <w:t xml:space="preserve">Estado 0: 3,51  (0,0069%)</w:t>
+            </w:r>
+          </w:p>
+          <w:p>
+            <w:r>
+              <w:t xml:space="preserve">Estado 1: 2,79  (0,0055%)</w:t>
+            </w:r>
+          </w:p>
+          <w:p>
+            <w:r>
+              <w:t xml:space="preserve">Estado 2: 3,92  (0,0077%)</w:t>
+            </w:r>
+          </w:p>
+          <w:p>
+            <w:r>
+              <w:t xml:space="preserve">Estado 3: 5,45  (0,0107%)</w:t>
+            </w:r>
+          </w:p>
+          <w:p>
+            <w:r>
+              <w:t xml:space="preserve">Estado 4: 3,09  (0,0061%)</w:t>
+            </w:r>
+          </w:p>
+          <w:p>
+            <w:r>
+              <w:t xml:space="preserve">Estado 5: 3,99  (0,0079%)</w:t>
+            </w:r>
+          </w:p>
+          <w:p>
+            <w:r>
+              <w:t xml:space="preserve">Estado 6: 7,72  (0,0152%)</w:t>
+            </w:r>
+          </w:p>
+          <w:p>
+            <w:r>
+              <w:t xml:space="preserve">Estado 7: 64,69  (0,1275%)</w:t>
+            </w:r>
+          </w:p>
+          <w:p>
+            <w:r>
+              <w:t xml:space="preserve">Estado 8: 2.905,58  (5,7253%)</w:t>
+            </w:r>
+          </w:p>
+          <w:p>
+            <w:r>
+              <w:t xml:space="preserve">Estado 9: 15.874,26  (31,2793%)</w:t>
+            </w:r>
+          </w:p>
+          <w:p>
+            <w:r>
+              <w:t xml:space="preserve">Estado 10: 31.875,11  (62,8080%)</w:t>
+            </w:r>
+          </w:p>
+          <w:p>
+            <w:r>
+              <w:rPr>
+                <w:b/>
+                <w:bCs/>
+              </w:rPr>
+              <w:t xml:space="preserve">Análise:</w:t>
+            </w:r>
+          </w:p>
+          <w:p>
+            <w:r>
+              <w:t xml:space="preserve">A Fila 3 recebe 80% do que sai da Fila 1 mais 70% do que sai da Fila 2 (que por sua vez recebe 50% de volta da própria Fila 3) — esse ciclo Fila 2 ↔ Fila 3 amplifica bastante o tráfego efetivo sobre a Fila 3. Resultado: a fila passa 94,1% do tempo com 8 clientes ou mais (praticamente cheia, K=10) e tem 11.583 perdas em 100.000 aleatórios, de longe a fila mais congestionada da rede.</w:t>
+            </w:r>
+          </w:p>
         </w:tc>
       </w:tr>
       <w:tr>
@@ -777,12 +747,11 @@
             <w:tcW w:w="9629" w:type="dxa"/>
             <w:shd w:val="clear" w:color="auto" w:fill="FFFFFF" w:themeFill="background1"/>
           </w:tcPr>
-          <w:p/>
-          <w:p/>
-          <w:p/>
-          <w:p/>
-          <w:p/>
-          <w:p/>
+          <w:p>
+            <w:r>
+              <w:t xml:space="preserve">50.750,10 (100.000 números pseudoaleatórios consumidos no total, contados em toda a rede)</w:t>
+            </w:r>
+          </w:p>
         </w:tc>
       </w:tr>
     </w:tbl>

</xml_diff>